<commit_message>
Add a clickable GitHub icon and profile link to the resume header
</commit_message>
<xml_diff>
--- a/cv/Nguyen_Hoang_Lam_TikTok_AI_Model_Data_Operation.docx
+++ b/cv/Nguyen_Hoang_Lam_TikTok_AI_Model_Data_Operation.docx
@@ -48,8 +48,66 @@
           <w:rFonts w:eastAsia="Arial" w:cs="Arial"/>
           <w:sz w:val="16"/>
         </w:rPr>
-        <w:t>0382-346-577  |  lyanmas.work@gmail.com  |  District 3, Ho Chi Minh City, Vietnam</w:t>
+        <w:t xml:space="preserve">0382-346-577  |  lyanmas.work@gmail.com  |  District 3, Ho Chi Minh City, Vietnam  |  </w:t>
       </w:r>
+      <w:hyperlink r:id="rId6" w:history="1">
+        <w:r>
+          <w:rPr>
+            <w:noProof/>
+          </w:rPr>
+          <w:drawing>
+            <wp:inline distT="0" distB="0" distL="0" distR="0" wp14:anchorId="58149089" wp14:editId="27F9B9B4">
+              <wp:extent cx="107899" cy="107899"/>
+              <wp:effectExtent l="0" t="0" r="0" b="0"/>
+              <wp:docPr id="1" name="Picture 1"/>
+              <wp:cNvGraphicFramePr>
+                <a:graphicFrameLocks xmlns:a="http://schemas.openxmlformats.org/drawingml/2006/main" noChangeAspect="1"/>
+              </wp:cNvGraphicFramePr>
+              <a:graphic xmlns:a="http://schemas.openxmlformats.org/drawingml/2006/main">
+                <a:graphicData uri="http://schemas.openxmlformats.org/drawingml/2006/picture">
+                  <pic:pic xmlns:pic="http://schemas.openxmlformats.org/drawingml/2006/picture">
+                    <pic:nvPicPr>
+                      <pic:cNvPr id="0" name="github-mark.png"/>
+                      <pic:cNvPicPr/>
+                    </pic:nvPicPr>
+                    <pic:blipFill>
+                      <a:blip r:embed="rId7"/>
+                      <a:stretch>
+                        <a:fillRect/>
+                      </a:stretch>
+                    </pic:blipFill>
+                    <pic:spPr>
+                      <a:xfrm>
+                        <a:off x="0" y="0"/>
+                        <a:ext cx="107899" cy="107899"/>
+                      </a:xfrm>
+                      <a:prstGeom prst="rect">
+                        <a:avLst/>
+                      </a:prstGeom>
+                    </pic:spPr>
+                  </pic:pic>
+                </a:graphicData>
+              </a:graphic>
+            </wp:inline>
+          </w:drawing>
+        </w:r>
+      </w:hyperlink>
+      <w:r>
+        <w:rPr>
+          <w:rFonts w:eastAsia="Arial" w:cs="Arial"/>
+          <w:sz w:val="16"/>
+        </w:rPr>
+        <w:t xml:space="preserve"> </w:t>
+      </w:r>
+      <w:hyperlink r:id="rId8" w:history="1">
+        <w:r>
+          <w:rPr>
+            <w:rFonts w:eastAsia="Arial" w:cs="Arial"/>
+            <w:sz w:val="16"/>
+          </w:rPr>
+          <w:t>github.com/LyanMas7</w:t>
+        </w:r>
+      </w:hyperlink>
     </w:p>
     <w:p>
       <w:pPr>
@@ -895,31 +953,31 @@
       </w:rPr>
     </w:lvl>
   </w:abstractNum>
-  <w:num w:numId="1" w16cid:durableId="350642675">
+  <w:num w:numId="1" w16cid:durableId="15355615">
     <w:abstractNumId w:val="8"/>
   </w:num>
-  <w:num w:numId="2" w16cid:durableId="603417702">
+  <w:num w:numId="2" w16cid:durableId="1811096558">
     <w:abstractNumId w:val="6"/>
   </w:num>
-  <w:num w:numId="3" w16cid:durableId="143397073">
+  <w:num w:numId="3" w16cid:durableId="1003246512">
     <w:abstractNumId w:val="5"/>
   </w:num>
-  <w:num w:numId="4" w16cid:durableId="4288795">
+  <w:num w:numId="4" w16cid:durableId="1020281866">
     <w:abstractNumId w:val="4"/>
   </w:num>
-  <w:num w:numId="5" w16cid:durableId="1526359824">
+  <w:num w:numId="5" w16cid:durableId="1225138039">
     <w:abstractNumId w:val="7"/>
   </w:num>
-  <w:num w:numId="6" w16cid:durableId="2023971009">
+  <w:num w:numId="6" w16cid:durableId="435102805">
     <w:abstractNumId w:val="3"/>
   </w:num>
-  <w:num w:numId="7" w16cid:durableId="1574927124">
+  <w:num w:numId="7" w16cid:durableId="2133936332">
     <w:abstractNumId w:val="2"/>
   </w:num>
-  <w:num w:numId="8" w16cid:durableId="582833389">
+  <w:num w:numId="8" w16cid:durableId="1454400744">
     <w:abstractNumId w:val="1"/>
   </w:num>
-  <w:num w:numId="9" w16cid:durableId="484787958">
+  <w:num w:numId="9" w16cid:durableId="1273784630">
     <w:abstractNumId w:val="0"/>
   </w:num>
 </w:numbering>

</xml_diff>